<commit_message>
Add BQs Supported column back to matrix table
</commit_message>
<xml_diff>
--- a/report_2/CONSULTING_REPORT_2_Team_1.docx
+++ b/report_2/CONSULTING_REPORT_2_Team_1.docx
@@ -760,16 +760,143 @@
         <w:tblLook w:firstColumn="1" w:firstRow="1" w:lastColumn="0" w:lastRow="0" w:noHBand="0" w:noVBand="1" w:val="04A0"/>
       </w:tblPr>
       <w:tblGrid>
-        <w:gridCol w:w="1560"/>
-        <w:gridCol w:w="1560"/>
-        <w:gridCol w:w="1560"/>
-        <w:gridCol w:w="1560"/>
-        <w:gridCol w:w="1560"/>
-        <w:gridCol w:w="1560"/>
+        <w:gridCol w:w="1337"/>
+        <w:gridCol w:w="1337"/>
+        <w:gridCol w:w="1337"/>
+        <w:gridCol w:w="1337"/>
+        <w:gridCol w:w="1337"/>
+        <w:gridCol w:w="1337"/>
+        <w:gridCol w:w="1337"/>
       </w:tblGrid>
       <w:tr>
         <w:tc>
           <w:tcPr>
+            <w:tcW w:type="dxa" w:w="1872"/>
+            <w:shd w:fill="D9E2F3" w:val="clear"/>
+          </w:tcPr>
+          <w:p>
+            <w:pPr>
+              <w:spacing w:after="0"/>
+              <w:jc w:val="center"/>
+            </w:pPr>
+            <w:r/>
+            <w:r>
+              <w:rPr>
+                <w:rFonts w:ascii="Times New Roman" w:hAnsi="Times New Roman"/>
+                <w:b/>
+                <w:sz w:val="18"/>
+              </w:rPr>
+              <w:t>Data Mart</w:t>
+            </w:r>
+          </w:p>
+        </w:tc>
+        <w:tc>
+          <w:tcPr>
+            <w:tcW w:type="dxa" w:w="792"/>
+            <w:shd w:fill="D9E2F3" w:val="clear"/>
+          </w:tcPr>
+          <w:p>
+            <w:pPr>
+              <w:spacing w:after="0"/>
+              <w:jc w:val="center"/>
+            </w:pPr>
+            <w:r/>
+            <w:r>
+              <w:rPr>
+                <w:rFonts w:ascii="Times New Roman" w:hAnsi="Times New Roman"/>
+                <w:b/>
+                <w:sz w:val="18"/>
+              </w:rPr>
+              <w:t>DimTime</w:t>
+            </w:r>
+          </w:p>
+        </w:tc>
+        <w:tc>
+          <w:tcPr>
+            <w:tcW w:type="dxa" w:w="792"/>
+            <w:shd w:fill="D9E2F3" w:val="clear"/>
+          </w:tcPr>
+          <w:p>
+            <w:pPr>
+              <w:spacing w:after="0"/>
+              <w:jc w:val="center"/>
+            </w:pPr>
+            <w:r/>
+            <w:r>
+              <w:rPr>
+                <w:rFonts w:ascii="Times New Roman" w:hAnsi="Times New Roman"/>
+                <w:b/>
+                <w:sz w:val="18"/>
+              </w:rPr>
+              <w:t>DimStore</w:t>
+            </w:r>
+          </w:p>
+        </w:tc>
+        <w:tc>
+          <w:tcPr>
+            <w:tcW w:type="dxa" w:w="936"/>
+            <w:shd w:fill="D9E2F3" w:val="clear"/>
+          </w:tcPr>
+          <w:p>
+            <w:pPr>
+              <w:spacing w:after="0"/>
+              <w:jc w:val="center"/>
+            </w:pPr>
+            <w:r/>
+            <w:r>
+              <w:rPr>
+                <w:rFonts w:ascii="Times New Roman" w:hAnsi="Times New Roman"/>
+                <w:b/>
+                <w:sz w:val="18"/>
+              </w:rPr>
+              <w:t>DimProduct</w:t>
+            </w:r>
+          </w:p>
+        </w:tc>
+        <w:tc>
+          <w:tcPr>
+            <w:tcW w:type="dxa" w:w="1008"/>
+            <w:shd w:fill="D9E2F3" w:val="clear"/>
+          </w:tcPr>
+          <w:p>
+            <w:pPr>
+              <w:spacing w:after="0"/>
+              <w:jc w:val="center"/>
+            </w:pPr>
+            <w:r/>
+            <w:r>
+              <w:rPr>
+                <w:rFonts w:ascii="Times New Roman" w:hAnsi="Times New Roman"/>
+                <w:b/>
+                <w:sz w:val="18"/>
+              </w:rPr>
+              <w:t>DimCategory</w:t>
+            </w:r>
+          </w:p>
+        </w:tc>
+        <w:tc>
+          <w:tcPr>
+            <w:tcW w:type="dxa" w:w="1080"/>
+            <w:shd w:fill="D9E2F3" w:val="clear"/>
+          </w:tcPr>
+          <w:p>
+            <w:pPr>
+              <w:spacing w:after="0"/>
+              <w:jc w:val="center"/>
+            </w:pPr>
+            <w:r/>
+            <w:r>
+              <w:rPr>
+                <w:rFonts w:ascii="Times New Roman" w:hAnsi="Times New Roman"/>
+                <w:b/>
+                <w:sz w:val="18"/>
+              </w:rPr>
+              <w:t>DimPromotion</w:t>
+            </w:r>
+          </w:p>
+        </w:tc>
+        <w:tc>
+          <w:tcPr>
             <w:tcW w:type="dxa" w:w="2160"/>
             <w:shd w:fill="D9E2F3" w:val="clear"/>
           </w:tcPr>
@@ -785,112 +912,7 @@
                 <w:b/>
                 <w:sz w:val="18"/>
               </w:rPr>
-              <w:t>Data Mart</w:t>
-            </w:r>
-          </w:p>
-        </w:tc>
-        <w:tc>
-          <w:tcPr>
-            <w:tcW w:type="dxa" w:w="1008"/>
-            <w:shd w:fill="D9E2F3" w:val="clear"/>
-          </w:tcPr>
-          <w:p>
-            <w:pPr>
-              <w:spacing w:after="0"/>
-              <w:jc w:val="center"/>
-            </w:pPr>
-            <w:r/>
-            <w:r>
-              <w:rPr>
-                <w:rFonts w:ascii="Times New Roman" w:hAnsi="Times New Roman"/>
-                <w:b/>
-                <w:sz w:val="18"/>
-              </w:rPr>
-              <w:t>DimTime</w:t>
-            </w:r>
-          </w:p>
-        </w:tc>
-        <w:tc>
-          <w:tcPr>
-            <w:tcW w:type="dxa" w:w="1008"/>
-            <w:shd w:fill="D9E2F3" w:val="clear"/>
-          </w:tcPr>
-          <w:p>
-            <w:pPr>
-              <w:spacing w:after="0"/>
-              <w:jc w:val="center"/>
-            </w:pPr>
-            <w:r/>
-            <w:r>
-              <w:rPr>
-                <w:rFonts w:ascii="Times New Roman" w:hAnsi="Times New Roman"/>
-                <w:b/>
-                <w:sz w:val="18"/>
-              </w:rPr>
-              <w:t>DimStore</w:t>
-            </w:r>
-          </w:p>
-        </w:tc>
-        <w:tc>
-          <w:tcPr>
-            <w:tcW w:type="dxa" w:w="1152"/>
-            <w:shd w:fill="D9E2F3" w:val="clear"/>
-          </w:tcPr>
-          <w:p>
-            <w:pPr>
-              <w:spacing w:after="0"/>
-              <w:jc w:val="center"/>
-            </w:pPr>
-            <w:r/>
-            <w:r>
-              <w:rPr>
-                <w:rFonts w:ascii="Times New Roman" w:hAnsi="Times New Roman"/>
-                <w:b/>
-                <w:sz w:val="18"/>
-              </w:rPr>
-              <w:t>DimProduct</w:t>
-            </w:r>
-          </w:p>
-        </w:tc>
-        <w:tc>
-          <w:tcPr>
-            <w:tcW w:type="dxa" w:w="1152"/>
-            <w:shd w:fill="D9E2F3" w:val="clear"/>
-          </w:tcPr>
-          <w:p>
-            <w:pPr>
-              <w:spacing w:after="0"/>
-              <w:jc w:val="center"/>
-            </w:pPr>
-            <w:r/>
-            <w:r>
-              <w:rPr>
-                <w:rFonts w:ascii="Times New Roman" w:hAnsi="Times New Roman"/>
-                <w:b/>
-                <w:sz w:val="18"/>
-              </w:rPr>
-              <w:t>DimCategory</w:t>
-            </w:r>
-          </w:p>
-        </w:tc>
-        <w:tc>
-          <w:tcPr>
-            <w:tcW w:type="dxa" w:w="1296"/>
-            <w:shd w:fill="D9E2F3" w:val="clear"/>
-          </w:tcPr>
-          <w:p>
-            <w:pPr>
-              <w:spacing w:after="0"/>
-              <w:jc w:val="center"/>
-            </w:pPr>
-            <w:r/>
-            <w:r>
-              <w:rPr>
-                <w:rFonts w:ascii="Times New Roman" w:hAnsi="Times New Roman"/>
-                <w:b/>
-                <w:sz w:val="18"/>
-              </w:rPr>
-              <w:t>DimPromotion</w:t>
+              <w:t>BQs Supported</w:t>
             </w:r>
           </w:p>
         </w:tc>
@@ -898,6 +920,114 @@
       <w:tr>
         <w:tc>
           <w:tcPr>
+            <w:tcW w:type="dxa" w:w="1872"/>
+          </w:tcPr>
+          <w:p>
+            <w:pPr>
+              <w:spacing w:after="0"/>
+            </w:pPr>
+            <w:r/>
+            <w:r>
+              <w:rPr>
+                <w:rFonts w:ascii="Times New Roman" w:hAnsi="Times New Roman"/>
+                <w:sz w:val="18"/>
+              </w:rPr>
+              <w:t>FactWeeklySales</w:t>
+            </w:r>
+          </w:p>
+        </w:tc>
+        <w:tc>
+          <w:tcPr>
+            <w:tcW w:type="dxa" w:w="792"/>
+          </w:tcPr>
+          <w:p>
+            <w:pPr>
+              <w:spacing w:after="0"/>
+            </w:pPr>
+            <w:r/>
+            <w:r>
+              <w:rPr>
+                <w:rFonts w:ascii="Times New Roman" w:hAnsi="Times New Roman"/>
+                <w:sz w:val="18"/>
+              </w:rPr>
+              <w:t>X</w:t>
+            </w:r>
+          </w:p>
+        </w:tc>
+        <w:tc>
+          <w:tcPr>
+            <w:tcW w:type="dxa" w:w="792"/>
+          </w:tcPr>
+          <w:p>
+            <w:pPr>
+              <w:spacing w:after="0"/>
+            </w:pPr>
+            <w:r/>
+            <w:r>
+              <w:rPr>
+                <w:rFonts w:ascii="Times New Roman" w:hAnsi="Times New Roman"/>
+                <w:sz w:val="18"/>
+              </w:rPr>
+              <w:t>X</w:t>
+            </w:r>
+          </w:p>
+        </w:tc>
+        <w:tc>
+          <w:tcPr>
+            <w:tcW w:type="dxa" w:w="936"/>
+          </w:tcPr>
+          <w:p>
+            <w:pPr>
+              <w:spacing w:after="0"/>
+            </w:pPr>
+            <w:r/>
+            <w:r>
+              <w:rPr>
+                <w:rFonts w:ascii="Times New Roman" w:hAnsi="Times New Roman"/>
+                <w:sz w:val="18"/>
+              </w:rPr>
+              <w:t>X</w:t>
+            </w:r>
+          </w:p>
+        </w:tc>
+        <w:tc>
+          <w:tcPr>
+            <w:tcW w:type="dxa" w:w="1008"/>
+          </w:tcPr>
+          <w:p>
+            <w:pPr>
+              <w:spacing w:after="0"/>
+            </w:pPr>
+            <w:r/>
+            <w:r>
+              <w:rPr>
+                <w:rFonts w:ascii="Times New Roman" w:hAnsi="Times New Roman"/>
+                <w:sz w:val="18"/>
+              </w:rPr>
+              <w:t>X</w:t>
+            </w:r>
+          </w:p>
+        </w:tc>
+        <w:tc>
+          <w:tcPr>
+            <w:tcW w:type="dxa" w:w="1080"/>
+          </w:tcPr>
+          <w:p>
+            <w:pPr>
+              <w:spacing w:after="0"/>
+            </w:pPr>
+            <w:r/>
+            <w:r>
+              <w:rPr>
+                <w:rFonts w:ascii="Times New Roman" w:hAnsi="Times New Roman"/>
+                <w:sz w:val="18"/>
+              </w:rPr>
+              <w:t>X</w:t>
+            </w:r>
+          </w:p>
+        </w:tc>
+        <w:tc>
+          <w:tcPr>
             <w:tcW w:type="dxa" w:w="2160"/>
           </w:tcPr>
           <w:p>
@@ -910,97 +1040,7 @@
                 <w:rFonts w:ascii="Times New Roman" w:hAnsi="Times New Roman"/>
                 <w:sz w:val="18"/>
               </w:rPr>
-              <w:t>FactWeeklySales</w:t>
-            </w:r>
-          </w:p>
-        </w:tc>
-        <w:tc>
-          <w:tcPr>
-            <w:tcW w:type="dxa" w:w="1008"/>
-          </w:tcPr>
-          <w:p>
-            <w:pPr>
-              <w:spacing w:after="0"/>
-            </w:pPr>
-            <w:r/>
-            <w:r>
-              <w:rPr>
-                <w:rFonts w:ascii="Times New Roman" w:hAnsi="Times New Roman"/>
-                <w:sz w:val="18"/>
-              </w:rPr>
-              <w:t>X</w:t>
-            </w:r>
-          </w:p>
-        </w:tc>
-        <w:tc>
-          <w:tcPr>
-            <w:tcW w:type="dxa" w:w="1008"/>
-          </w:tcPr>
-          <w:p>
-            <w:pPr>
-              <w:spacing w:after="0"/>
-            </w:pPr>
-            <w:r/>
-            <w:r>
-              <w:rPr>
-                <w:rFonts w:ascii="Times New Roman" w:hAnsi="Times New Roman"/>
-                <w:sz w:val="18"/>
-              </w:rPr>
-              <w:t>X</w:t>
-            </w:r>
-          </w:p>
-        </w:tc>
-        <w:tc>
-          <w:tcPr>
-            <w:tcW w:type="dxa" w:w="1152"/>
-          </w:tcPr>
-          <w:p>
-            <w:pPr>
-              <w:spacing w:after="0"/>
-            </w:pPr>
-            <w:r/>
-            <w:r>
-              <w:rPr>
-                <w:rFonts w:ascii="Times New Roman" w:hAnsi="Times New Roman"/>
-                <w:sz w:val="18"/>
-              </w:rPr>
-              <w:t>X</w:t>
-            </w:r>
-          </w:p>
-        </w:tc>
-        <w:tc>
-          <w:tcPr>
-            <w:tcW w:type="dxa" w:w="1152"/>
-          </w:tcPr>
-          <w:p>
-            <w:pPr>
-              <w:spacing w:after="0"/>
-            </w:pPr>
-            <w:r/>
-            <w:r>
-              <w:rPr>
-                <w:rFonts w:ascii="Times New Roman" w:hAnsi="Times New Roman"/>
-                <w:sz w:val="18"/>
-              </w:rPr>
-              <w:t>X</w:t>
-            </w:r>
-          </w:p>
-        </w:tc>
-        <w:tc>
-          <w:tcPr>
-            <w:tcW w:type="dxa" w:w="1296"/>
-          </w:tcPr>
-          <w:p>
-            <w:pPr>
-              <w:spacing w:after="0"/>
-            </w:pPr>
-            <w:r/>
-            <w:r>
-              <w:rPr>
-                <w:rFonts w:ascii="Times New Roman" w:hAnsi="Times New Roman"/>
-                <w:sz w:val="18"/>
-              </w:rPr>
-              <w:t>X</w:t>
+              <w:t>BQ2, BQ3, BQ4, BQ8, BQ9</w:t>
             </w:r>
           </w:p>
         </w:tc>
@@ -1008,6 +1048,111 @@
       <w:tr>
         <w:tc>
           <w:tcPr>
+            <w:tcW w:type="dxa" w:w="1872"/>
+          </w:tcPr>
+          <w:p>
+            <w:pPr>
+              <w:spacing w:after="0"/>
+            </w:pPr>
+            <w:r/>
+            <w:r>
+              <w:rPr>
+                <w:rFonts w:ascii="Times New Roman" w:hAnsi="Times New Roman"/>
+                <w:sz w:val="18"/>
+              </w:rPr>
+              <w:t>FactCustomerTraffic</w:t>
+            </w:r>
+          </w:p>
+        </w:tc>
+        <w:tc>
+          <w:tcPr>
+            <w:tcW w:type="dxa" w:w="792"/>
+          </w:tcPr>
+          <w:p>
+            <w:pPr>
+              <w:spacing w:after="0"/>
+            </w:pPr>
+            <w:r/>
+            <w:r>
+              <w:rPr>
+                <w:rFonts w:ascii="Times New Roman" w:hAnsi="Times New Roman"/>
+                <w:sz w:val="18"/>
+              </w:rPr>
+              <w:t>X</w:t>
+            </w:r>
+          </w:p>
+        </w:tc>
+        <w:tc>
+          <w:tcPr>
+            <w:tcW w:type="dxa" w:w="792"/>
+          </w:tcPr>
+          <w:p>
+            <w:pPr>
+              <w:spacing w:after="0"/>
+            </w:pPr>
+            <w:r/>
+            <w:r>
+              <w:rPr>
+                <w:rFonts w:ascii="Times New Roman" w:hAnsi="Times New Roman"/>
+                <w:sz w:val="18"/>
+              </w:rPr>
+              <w:t>X</w:t>
+            </w:r>
+          </w:p>
+        </w:tc>
+        <w:tc>
+          <w:tcPr>
+            <w:tcW w:type="dxa" w:w="936"/>
+          </w:tcPr>
+          <w:p>
+            <w:pPr>
+              <w:spacing w:after="0"/>
+            </w:pPr>
+            <w:r/>
+            <w:r>
+              <w:rPr>
+                <w:rFonts w:ascii="Times New Roman" w:hAnsi="Times New Roman"/>
+                <w:sz w:val="18"/>
+              </w:rPr>
+            </w:r>
+          </w:p>
+        </w:tc>
+        <w:tc>
+          <w:tcPr>
+            <w:tcW w:type="dxa" w:w="1008"/>
+          </w:tcPr>
+          <w:p>
+            <w:pPr>
+              <w:spacing w:after="0"/>
+            </w:pPr>
+            <w:r/>
+            <w:r>
+              <w:rPr>
+                <w:rFonts w:ascii="Times New Roman" w:hAnsi="Times New Roman"/>
+                <w:sz w:val="18"/>
+              </w:rPr>
+            </w:r>
+          </w:p>
+        </w:tc>
+        <w:tc>
+          <w:tcPr>
+            <w:tcW w:type="dxa" w:w="1080"/>
+          </w:tcPr>
+          <w:p>
+            <w:pPr>
+              <w:spacing w:after="0"/>
+            </w:pPr>
+            <w:r/>
+            <w:r>
+              <w:rPr>
+                <w:rFonts w:ascii="Times New Roman" w:hAnsi="Times New Roman"/>
+                <w:sz w:val="18"/>
+              </w:rPr>
+            </w:r>
+          </w:p>
+        </w:tc>
+        <w:tc>
+          <w:tcPr>
             <w:tcW w:type="dxa" w:w="2160"/>
           </w:tcPr>
           <w:p>
@@ -1020,94 +1165,7 @@
                 <w:rFonts w:ascii="Times New Roman" w:hAnsi="Times New Roman"/>
                 <w:sz w:val="18"/>
               </w:rPr>
-              <w:t>FactCustomerTraffic</w:t>
-            </w:r>
-          </w:p>
-        </w:tc>
-        <w:tc>
-          <w:tcPr>
-            <w:tcW w:type="dxa" w:w="1008"/>
-          </w:tcPr>
-          <w:p>
-            <w:pPr>
-              <w:spacing w:after="0"/>
-            </w:pPr>
-            <w:r/>
-            <w:r>
-              <w:rPr>
-                <w:rFonts w:ascii="Times New Roman" w:hAnsi="Times New Roman"/>
-                <w:sz w:val="18"/>
-              </w:rPr>
-              <w:t>X</w:t>
-            </w:r>
-          </w:p>
-        </w:tc>
-        <w:tc>
-          <w:tcPr>
-            <w:tcW w:type="dxa" w:w="1008"/>
-          </w:tcPr>
-          <w:p>
-            <w:pPr>
-              <w:spacing w:after="0"/>
-            </w:pPr>
-            <w:r/>
-            <w:r>
-              <w:rPr>
-                <w:rFonts w:ascii="Times New Roman" w:hAnsi="Times New Roman"/>
-                <w:sz w:val="18"/>
-              </w:rPr>
-              <w:t>X</w:t>
-            </w:r>
-          </w:p>
-        </w:tc>
-        <w:tc>
-          <w:tcPr>
-            <w:tcW w:type="dxa" w:w="1152"/>
-          </w:tcPr>
-          <w:p>
-            <w:pPr>
-              <w:spacing w:after="0"/>
-            </w:pPr>
-            <w:r/>
-            <w:r>
-              <w:rPr>
-                <w:rFonts w:ascii="Times New Roman" w:hAnsi="Times New Roman"/>
-                <w:sz w:val="18"/>
-              </w:rPr>
-            </w:r>
-          </w:p>
-        </w:tc>
-        <w:tc>
-          <w:tcPr>
-            <w:tcW w:type="dxa" w:w="1152"/>
-          </w:tcPr>
-          <w:p>
-            <w:pPr>
-              <w:spacing w:after="0"/>
-            </w:pPr>
-            <w:r/>
-            <w:r>
-              <w:rPr>
-                <w:rFonts w:ascii="Times New Roman" w:hAnsi="Times New Roman"/>
-                <w:sz w:val="18"/>
-              </w:rPr>
-            </w:r>
-          </w:p>
-        </w:tc>
-        <w:tc>
-          <w:tcPr>
-            <w:tcW w:type="dxa" w:w="1296"/>
-          </w:tcPr>
-          <w:p>
-            <w:pPr>
-              <w:spacing w:after="0"/>
-            </w:pPr>
-            <w:r/>
-            <w:r>
-              <w:rPr>
-                <w:rFonts w:ascii="Times New Roman" w:hAnsi="Times New Roman"/>
-                <w:sz w:val="18"/>
-              </w:rPr>
+              <w:t>(supplementary)</w:t>
             </w:r>
           </w:p>
         </w:tc>

</xml_diff>